<commit_message>
Updated Final Report and README documentation
</commit_message>
<xml_diff>
--- a/Data Science Capstone 3 Project/reports/Data_Science_Capstone_3_EV_Adoption_Project_Report.docx
+++ b/Data Science Capstone 3 Project/reports/Data_Science_Capstone_3_EV_Adoption_Project_Report.docx
@@ -192,15 +192,7 @@
           <w:sz w:val="24"/>
           <w:szCs w:val="24"/>
         </w:rPr>
-        <w:t>Two complementary models were built on a merged 2017–2025 county-year dataset spanning 39 Washington counties: a Ridge regression model to quantify drivers of EV adoption rate, and a K-Means clustering model to segment counties by adoption profile. The Ridge model explained approximately 96% of the variance in (transformed) adoption rate on a held-out 2024–2025 test set, with prior-year adoption momentum, median income, and charging infrastructure density emerging as the strongest predictors, in that order.</w:t>
-      </w:r>
-      <w:r>
-        <w:rPr>
-          <w:rFonts w:ascii="Calibri" w:hAnsi="Calibri" w:cs="Calibri"/>
-          <w:sz w:val="24"/>
-          <w:szCs w:val="24"/>
-        </w:rPr>
-        <w:t xml:space="preserve"> The clustering model identified three distinct county segments — a high-income/high-adoption group, a </w:t>
+        <w:t xml:space="preserve">Two complementary models were built on a merged 2017–2025 county-year dataset spanning 39 Washington counties: a Ridge regression model to quantify drivers of EV adoption rate, and a K-Means clustering model to segment counties by adoption profile. The Ridge model explained approximately 96% of the variance in (transformed) adoption rate on a held-out 2024–2025 test set, with prior-year adoption momentum, median income, and charging infrastructure density emerging as the strongest predictors, in that order. The clustering model identified three distinct county segments — a high-income/high-adoption group, a </w:t>
       </w:r>
       <w:r>
         <w:rPr>
@@ -1961,15 +1953,245 @@
           <w:sz w:val="24"/>
           <w:szCs w:val="24"/>
         </w:rPr>
-        <w:t>-heavy counties</w:t>
-      </w:r>
-      <w:r>
-        <w:rPr>
-          <w:rFonts w:ascii="Calibri" w:hAnsi="Calibri" w:cs="Calibri"/>
-          <w:sz w:val="24"/>
-          <w:szCs w:val="24"/>
-        </w:rPr>
-        <w:t>.</w:t>
+        <w:t>-heavy counties.</w:t>
+      </w:r>
+    </w:p>
+    <w:p>
+      <w:pPr>
+        <w:spacing w:after="160"/>
+        <w:rPr>
+          <w:rFonts w:ascii="Calibri" w:hAnsi="Calibri" w:cs="Calibri"/>
+          <w:sz w:val="24"/>
+          <w:szCs w:val="24"/>
+        </w:rPr>
+      </w:pPr>
+      <w:r>
+        <w:rPr>
+          <w:rFonts w:ascii="Calibri" w:hAnsi="Calibri" w:cs="Calibri"/>
+          <w:noProof/>
+          <w:sz w:val="24"/>
+          <w:szCs w:val="24"/>
+        </w:rPr>
+        <w:drawing>
+          <wp:inline distT="0" distB="0" distL="0" distR="0" wp14:anchorId="0B0AA506" wp14:editId="133B6FFE">
+            <wp:extent cx="5943600" cy="1953260"/>
+            <wp:effectExtent l="0" t="0" r="0" b="8890"/>
+            <wp:docPr id="1802615803" name="Picture 1"/>
+            <wp:cNvGraphicFramePr>
+              <a:graphicFrameLocks xmlns:a="http://schemas.openxmlformats.org/drawingml/2006/main" noChangeAspect="1"/>
+            </wp:cNvGraphicFramePr>
+            <a:graphic xmlns:a="http://schemas.openxmlformats.org/drawingml/2006/main">
+              <a:graphicData uri="http://schemas.openxmlformats.org/drawingml/2006/picture">
+                <pic:pic xmlns:pic="http://schemas.openxmlformats.org/drawingml/2006/picture">
+                  <pic:nvPicPr>
+                    <pic:cNvPr id="1802615803" name="Picture 1802615803"/>
+                    <pic:cNvPicPr/>
+                  </pic:nvPicPr>
+                  <pic:blipFill>
+                    <a:blip r:embed="rId11" cstate="print">
+                      <a:extLst>
+                        <a:ext uri="{28A0092B-C50C-407E-A947-70E740481C1C}">
+                          <a14:useLocalDpi xmlns:a14="http://schemas.microsoft.com/office/drawing/2010/main" val="0"/>
+                        </a:ext>
+                      </a:extLst>
+                    </a:blip>
+                    <a:stretch>
+                      <a:fillRect/>
+                    </a:stretch>
+                  </pic:blipFill>
+                  <pic:spPr>
+                    <a:xfrm>
+                      <a:off x="0" y="0"/>
+                      <a:ext cx="5943600" cy="1953260"/>
+                    </a:xfrm>
+                    <a:prstGeom prst="rect">
+                      <a:avLst/>
+                    </a:prstGeom>
+                  </pic:spPr>
+                </pic:pic>
+              </a:graphicData>
+            </a:graphic>
+          </wp:inline>
+        </w:drawing>
+      </w:r>
+    </w:p>
+    <w:p>
+      <w:pPr>
+        <w:spacing w:after="160"/>
+        <w:rPr>
+          <w:rFonts w:ascii="Calibri" w:hAnsi="Calibri" w:cs="Calibri"/>
+          <w:sz w:val="24"/>
+          <w:szCs w:val="24"/>
+        </w:rPr>
+      </w:pPr>
+      <w:r>
+        <w:rPr>
+          <w:rFonts w:ascii="Calibri" w:hAnsi="Calibri" w:cs="Calibri"/>
+          <w:noProof/>
+          <w:sz w:val="24"/>
+          <w:szCs w:val="24"/>
+        </w:rPr>
+        <w:drawing>
+          <wp:inline distT="0" distB="0" distL="0" distR="0" wp14:anchorId="2A9B276E" wp14:editId="275216A5">
+            <wp:extent cx="5943600" cy="1953260"/>
+            <wp:effectExtent l="0" t="0" r="0" b="8890"/>
+            <wp:docPr id="1794942548" name="Picture 3"/>
+            <wp:cNvGraphicFramePr>
+              <a:graphicFrameLocks xmlns:a="http://schemas.openxmlformats.org/drawingml/2006/main" noChangeAspect="1"/>
+            </wp:cNvGraphicFramePr>
+            <a:graphic xmlns:a="http://schemas.openxmlformats.org/drawingml/2006/main">
+              <a:graphicData uri="http://schemas.openxmlformats.org/drawingml/2006/picture">
+                <pic:pic xmlns:pic="http://schemas.openxmlformats.org/drawingml/2006/picture">
+                  <pic:nvPicPr>
+                    <pic:cNvPr id="1794942548" name="Picture 1794942548"/>
+                    <pic:cNvPicPr/>
+                  </pic:nvPicPr>
+                  <pic:blipFill>
+                    <a:blip r:embed="rId12" cstate="print">
+                      <a:extLst>
+                        <a:ext uri="{28A0092B-C50C-407E-A947-70E740481C1C}">
+                          <a14:useLocalDpi xmlns:a14="http://schemas.microsoft.com/office/drawing/2010/main" val="0"/>
+                        </a:ext>
+                      </a:extLst>
+                    </a:blip>
+                    <a:stretch>
+                      <a:fillRect/>
+                    </a:stretch>
+                  </pic:blipFill>
+                  <pic:spPr>
+                    <a:xfrm>
+                      <a:off x="0" y="0"/>
+                      <a:ext cx="5943600" cy="1953260"/>
+                    </a:xfrm>
+                    <a:prstGeom prst="rect">
+                      <a:avLst/>
+                    </a:prstGeom>
+                  </pic:spPr>
+                </pic:pic>
+              </a:graphicData>
+            </a:graphic>
+          </wp:inline>
+        </w:drawing>
+      </w:r>
+    </w:p>
+    <w:p>
+      <w:pPr>
+        <w:spacing w:after="160"/>
+        <w:rPr>
+          <w:rFonts w:ascii="Calibri" w:hAnsi="Calibri" w:cs="Calibri"/>
+          <w:noProof/>
+          <w:sz w:val="24"/>
+          <w:szCs w:val="24"/>
+        </w:rPr>
+      </w:pPr>
+      <w:r>
+        <w:rPr>
+          <w:rFonts w:ascii="Calibri" w:hAnsi="Calibri" w:cs="Calibri"/>
+          <w:noProof/>
+          <w:sz w:val="24"/>
+          <w:szCs w:val="24"/>
+        </w:rPr>
+        <w:lastRenderedPageBreak/>
+        <w:drawing>
+          <wp:inline distT="0" distB="0" distL="0" distR="0" wp14:anchorId="6F703E7D" wp14:editId="50B421E0">
+            <wp:extent cx="5943600" cy="1953260"/>
+            <wp:effectExtent l="0" t="0" r="0" b="8890"/>
+            <wp:docPr id="1360087503" name="Picture 4"/>
+            <wp:cNvGraphicFramePr>
+              <a:graphicFrameLocks xmlns:a="http://schemas.openxmlformats.org/drawingml/2006/main" noChangeAspect="1"/>
+            </wp:cNvGraphicFramePr>
+            <a:graphic xmlns:a="http://schemas.openxmlformats.org/drawingml/2006/main">
+              <a:graphicData uri="http://schemas.openxmlformats.org/drawingml/2006/picture">
+                <pic:pic xmlns:pic="http://schemas.openxmlformats.org/drawingml/2006/picture">
+                  <pic:nvPicPr>
+                    <pic:cNvPr id="1360087503" name="Picture 1360087503"/>
+                    <pic:cNvPicPr/>
+                  </pic:nvPicPr>
+                  <pic:blipFill>
+                    <a:blip r:embed="rId13" cstate="print">
+                      <a:extLst>
+                        <a:ext uri="{28A0092B-C50C-407E-A947-70E740481C1C}">
+                          <a14:useLocalDpi xmlns:a14="http://schemas.microsoft.com/office/drawing/2010/main" val="0"/>
+                        </a:ext>
+                      </a:extLst>
+                    </a:blip>
+                    <a:stretch>
+                      <a:fillRect/>
+                    </a:stretch>
+                  </pic:blipFill>
+                  <pic:spPr>
+                    <a:xfrm>
+                      <a:off x="0" y="0"/>
+                      <a:ext cx="5943600" cy="1953260"/>
+                    </a:xfrm>
+                    <a:prstGeom prst="rect">
+                      <a:avLst/>
+                    </a:prstGeom>
+                  </pic:spPr>
+                </pic:pic>
+              </a:graphicData>
+            </a:graphic>
+          </wp:inline>
+        </w:drawing>
+      </w:r>
+    </w:p>
+    <w:p>
+      <w:pPr>
+        <w:spacing w:after="160"/>
+        <w:rPr>
+          <w:rFonts w:ascii="Calibri" w:hAnsi="Calibri" w:cs="Calibri"/>
+          <w:sz w:val="24"/>
+          <w:szCs w:val="24"/>
+        </w:rPr>
+      </w:pPr>
+      <w:r>
+        <w:rPr>
+          <w:rFonts w:ascii="Calibri" w:hAnsi="Calibri" w:cs="Calibri"/>
+          <w:noProof/>
+          <w:sz w:val="24"/>
+          <w:szCs w:val="24"/>
+        </w:rPr>
+        <w:drawing>
+          <wp:inline distT="0" distB="0" distL="0" distR="0" wp14:anchorId="6CBD69A7" wp14:editId="05C77A86">
+            <wp:extent cx="5943600" cy="1953260"/>
+            <wp:effectExtent l="0" t="0" r="0" b="8890"/>
+            <wp:docPr id="2034918382" name="Picture 6"/>
+            <wp:cNvGraphicFramePr>
+              <a:graphicFrameLocks xmlns:a="http://schemas.openxmlformats.org/drawingml/2006/main" noChangeAspect="1"/>
+            </wp:cNvGraphicFramePr>
+            <a:graphic xmlns:a="http://schemas.openxmlformats.org/drawingml/2006/main">
+              <a:graphicData uri="http://schemas.openxmlformats.org/drawingml/2006/picture">
+                <pic:pic xmlns:pic="http://schemas.openxmlformats.org/drawingml/2006/picture">
+                  <pic:nvPicPr>
+                    <pic:cNvPr id="2034918382" name="Picture 2034918382"/>
+                    <pic:cNvPicPr/>
+                  </pic:nvPicPr>
+                  <pic:blipFill>
+                    <a:blip r:embed="rId14" cstate="print">
+                      <a:extLst>
+                        <a:ext uri="{28A0092B-C50C-407E-A947-70E740481C1C}">
+                          <a14:useLocalDpi xmlns:a14="http://schemas.microsoft.com/office/drawing/2010/main" val="0"/>
+                        </a:ext>
+                      </a:extLst>
+                    </a:blip>
+                    <a:stretch>
+                      <a:fillRect/>
+                    </a:stretch>
+                  </pic:blipFill>
+                  <pic:spPr>
+                    <a:xfrm>
+                      <a:off x="0" y="0"/>
+                      <a:ext cx="5943600" cy="1953260"/>
+                    </a:xfrm>
+                    <a:prstGeom prst="rect">
+                      <a:avLst/>
+                    </a:prstGeom>
+                  </pic:spPr>
+                </pic:pic>
+              </a:graphicData>
+            </a:graphic>
+          </wp:inline>
+        </w:drawing>
       </w:r>
     </w:p>
     <w:p>
@@ -2538,7 +2760,23 @@
                 <w:sz w:val="24"/>
                 <w:szCs w:val="24"/>
               </w:rPr>
-              <w:t>-0.17 (distorted by rural outliers)</w:t>
+              <w:t>-0.1</w:t>
+            </w:r>
+            <w:r>
+              <w:rPr>
+                <w:rFonts w:ascii="Calibri" w:hAnsi="Calibri" w:cs="Calibri"/>
+                <w:sz w:val="24"/>
+                <w:szCs w:val="24"/>
+              </w:rPr>
+              <w:t>6</w:t>
+            </w:r>
+            <w:r>
+              <w:rPr>
+                <w:rFonts w:ascii="Calibri" w:hAnsi="Calibri" w:cs="Calibri"/>
+                <w:sz w:val="24"/>
+                <w:szCs w:val="24"/>
+              </w:rPr>
+              <w:t xml:space="preserve"> (distorted by rural outliers)</w:t>
             </w:r>
           </w:p>
         </w:tc>
@@ -2616,6 +2854,145 @@
     </w:p>
     <w:p>
       <w:pPr>
+        <w:spacing w:after="160"/>
+        <w:rPr>
+          <w:rFonts w:ascii="Calibri" w:hAnsi="Calibri" w:cs="Calibri"/>
+          <w:sz w:val="24"/>
+          <w:szCs w:val="24"/>
+        </w:rPr>
+      </w:pPr>
+      <w:r>
+        <w:rPr>
+          <w:rFonts w:ascii="Calibri" w:hAnsi="Calibri" w:cs="Calibri"/>
+          <w:noProof/>
+          <w:sz w:val="24"/>
+          <w:szCs w:val="24"/>
+        </w:rPr>
+        <w:lastRenderedPageBreak/>
+        <w:drawing>
+          <wp:inline distT="0" distB="0" distL="0" distR="0" wp14:anchorId="752FB73C" wp14:editId="02FB826E">
+            <wp:extent cx="5943600" cy="5203190"/>
+            <wp:effectExtent l="0" t="0" r="0" b="0"/>
+            <wp:docPr id="1664044651" name="Picture 7"/>
+            <wp:cNvGraphicFramePr>
+              <a:graphicFrameLocks xmlns:a="http://schemas.openxmlformats.org/drawingml/2006/main" noChangeAspect="1"/>
+            </wp:cNvGraphicFramePr>
+            <a:graphic xmlns:a="http://schemas.openxmlformats.org/drawingml/2006/main">
+              <a:graphicData uri="http://schemas.openxmlformats.org/drawingml/2006/picture">
+                <pic:pic xmlns:pic="http://schemas.openxmlformats.org/drawingml/2006/picture">
+                  <pic:nvPicPr>
+                    <pic:cNvPr id="1664044651" name="Picture 1664044651"/>
+                    <pic:cNvPicPr/>
+                  </pic:nvPicPr>
+                  <pic:blipFill>
+                    <a:blip r:embed="rId15" cstate="print">
+                      <a:extLst>
+                        <a:ext uri="{28A0092B-C50C-407E-A947-70E740481C1C}">
+                          <a14:useLocalDpi xmlns:a14="http://schemas.microsoft.com/office/drawing/2010/main" val="0"/>
+                        </a:ext>
+                      </a:extLst>
+                    </a:blip>
+                    <a:stretch>
+                      <a:fillRect/>
+                    </a:stretch>
+                  </pic:blipFill>
+                  <pic:spPr>
+                    <a:xfrm>
+                      <a:off x="0" y="0"/>
+                      <a:ext cx="5943600" cy="5203190"/>
+                    </a:xfrm>
+                    <a:prstGeom prst="rect">
+                      <a:avLst/>
+                    </a:prstGeom>
+                  </pic:spPr>
+                </pic:pic>
+              </a:graphicData>
+            </a:graphic>
+          </wp:inline>
+        </w:drawing>
+      </w:r>
+    </w:p>
+    <w:p>
+      <w:pPr>
+        <w:spacing w:after="160"/>
+        <w:rPr>
+          <w:rFonts w:ascii="Calibri" w:hAnsi="Calibri" w:cs="Calibri"/>
+          <w:sz w:val="24"/>
+          <w:szCs w:val="24"/>
+        </w:rPr>
+      </w:pPr>
+      <w:r>
+        <w:rPr>
+          <w:rFonts w:ascii="Calibri" w:hAnsi="Calibri" w:cs="Calibri"/>
+          <w:noProof/>
+          <w:sz w:val="24"/>
+          <w:szCs w:val="24"/>
+        </w:rPr>
+        <w:lastRenderedPageBreak/>
+        <w:drawing>
+          <wp:inline distT="0" distB="0" distL="0" distR="0" wp14:anchorId="3BBEF284" wp14:editId="5D2923BC">
+            <wp:extent cx="5943600" cy="4914900"/>
+            <wp:effectExtent l="0" t="0" r="0" b="0"/>
+            <wp:docPr id="980221679" name="Picture 8"/>
+            <wp:cNvGraphicFramePr>
+              <a:graphicFrameLocks xmlns:a="http://schemas.openxmlformats.org/drawingml/2006/main" noChangeAspect="1"/>
+            </wp:cNvGraphicFramePr>
+            <a:graphic xmlns:a="http://schemas.openxmlformats.org/drawingml/2006/main">
+              <a:graphicData uri="http://schemas.openxmlformats.org/drawingml/2006/picture">
+                <pic:pic xmlns:pic="http://schemas.openxmlformats.org/drawingml/2006/picture">
+                  <pic:nvPicPr>
+                    <pic:cNvPr id="980221679" name="Picture 980221679"/>
+                    <pic:cNvPicPr/>
+                  </pic:nvPicPr>
+                  <pic:blipFill rotWithShape="1">
+                    <a:blip r:embed="rId16" cstate="print">
+                      <a:extLst>
+                        <a:ext uri="{28A0092B-C50C-407E-A947-70E740481C1C}">
+                          <a14:useLocalDpi xmlns:a14="http://schemas.microsoft.com/office/drawing/2010/main" val="0"/>
+                        </a:ext>
+                      </a:extLst>
+                    </a:blip>
+                    <a:srcRect b="33264"/>
+                    <a:stretch>
+                      <a:fillRect/>
+                    </a:stretch>
+                  </pic:blipFill>
+                  <pic:spPr bwMode="auto">
+                    <a:xfrm>
+                      <a:off x="0" y="0"/>
+                      <a:ext cx="5943600" cy="4914900"/>
+                    </a:xfrm>
+                    <a:prstGeom prst="rect">
+                      <a:avLst/>
+                    </a:prstGeom>
+                    <a:ln>
+                      <a:noFill/>
+                    </a:ln>
+                    <a:extLst>
+                      <a:ext uri="{53640926-AAD7-44D8-BBD7-CCE9431645EC}">
+                        <a14:shadowObscured xmlns:a14="http://schemas.microsoft.com/office/drawing/2010/main"/>
+                      </a:ext>
+                    </a:extLst>
+                  </pic:spPr>
+                </pic:pic>
+              </a:graphicData>
+            </a:graphic>
+          </wp:inline>
+        </w:drawing>
+      </w:r>
+    </w:p>
+    <w:p>
+      <w:pPr>
+        <w:spacing w:after="160"/>
+        <w:rPr>
+          <w:rFonts w:ascii="Calibri" w:hAnsi="Calibri" w:cs="Calibri"/>
+          <w:sz w:val="24"/>
+          <w:szCs w:val="24"/>
+        </w:rPr>
+      </w:pPr>
+    </w:p>
+    <w:p>
+      <w:pPr>
         <w:pStyle w:val="Heading3"/>
         <w:spacing w:before="220" w:after="120"/>
         <w:rPr>
@@ -2653,6 +3030,126 @@
     </w:p>
     <w:p>
       <w:pPr>
+        <w:spacing w:after="160"/>
+        <w:rPr>
+          <w:rFonts w:ascii="Calibri" w:hAnsi="Calibri" w:cs="Calibri"/>
+          <w:sz w:val="24"/>
+          <w:szCs w:val="24"/>
+        </w:rPr>
+      </w:pPr>
+      <w:r>
+        <w:rPr>
+          <w:rFonts w:ascii="Calibri" w:hAnsi="Calibri" w:cs="Calibri"/>
+          <w:noProof/>
+          <w:sz w:val="24"/>
+          <w:szCs w:val="24"/>
+        </w:rPr>
+        <w:lastRenderedPageBreak/>
+        <w:drawing>
+          <wp:inline distT="0" distB="0" distL="0" distR="0" wp14:anchorId="51D5E5F1" wp14:editId="729BB3E8">
+            <wp:extent cx="5943600" cy="4443730"/>
+            <wp:effectExtent l="0" t="0" r="0" b="0"/>
+            <wp:docPr id="1685641802" name="Picture 9"/>
+            <wp:cNvGraphicFramePr>
+              <a:graphicFrameLocks xmlns:a="http://schemas.openxmlformats.org/drawingml/2006/main" noChangeAspect="1"/>
+            </wp:cNvGraphicFramePr>
+            <a:graphic xmlns:a="http://schemas.openxmlformats.org/drawingml/2006/main">
+              <a:graphicData uri="http://schemas.openxmlformats.org/drawingml/2006/picture">
+                <pic:pic xmlns:pic="http://schemas.openxmlformats.org/drawingml/2006/picture">
+                  <pic:nvPicPr>
+                    <pic:cNvPr id="1685641802" name="Picture 1685641802"/>
+                    <pic:cNvPicPr/>
+                  </pic:nvPicPr>
+                  <pic:blipFill>
+                    <a:blip r:embed="rId17" cstate="print">
+                      <a:extLst>
+                        <a:ext uri="{28A0092B-C50C-407E-A947-70E740481C1C}">
+                          <a14:useLocalDpi xmlns:a14="http://schemas.microsoft.com/office/drawing/2010/main" val="0"/>
+                        </a:ext>
+                      </a:extLst>
+                    </a:blip>
+                    <a:stretch>
+                      <a:fillRect/>
+                    </a:stretch>
+                  </pic:blipFill>
+                  <pic:spPr>
+                    <a:xfrm>
+                      <a:off x="0" y="0"/>
+                      <a:ext cx="5943600" cy="4443730"/>
+                    </a:xfrm>
+                    <a:prstGeom prst="rect">
+                      <a:avLst/>
+                    </a:prstGeom>
+                  </pic:spPr>
+                </pic:pic>
+              </a:graphicData>
+            </a:graphic>
+          </wp:inline>
+        </w:drawing>
+      </w:r>
+    </w:p>
+    <w:p>
+      <w:pPr>
+        <w:spacing w:after="160"/>
+        <w:rPr>
+          <w:rFonts w:ascii="Calibri" w:hAnsi="Calibri" w:cs="Calibri"/>
+          <w:sz w:val="24"/>
+          <w:szCs w:val="24"/>
+        </w:rPr>
+      </w:pPr>
+      <w:r>
+        <w:rPr>
+          <w:rFonts w:ascii="Calibri" w:hAnsi="Calibri" w:cs="Calibri"/>
+          <w:noProof/>
+          <w:sz w:val="24"/>
+          <w:szCs w:val="24"/>
+        </w:rPr>
+        <w:lastRenderedPageBreak/>
+        <w:drawing>
+          <wp:inline distT="0" distB="0" distL="0" distR="0" wp14:anchorId="5BBFF75E" wp14:editId="6948EF8E">
+            <wp:extent cx="5754636" cy="4291593"/>
+            <wp:effectExtent l="0" t="0" r="0" b="0"/>
+            <wp:docPr id="1146352224" name="Picture 12"/>
+            <wp:cNvGraphicFramePr>
+              <a:graphicFrameLocks xmlns:a="http://schemas.openxmlformats.org/drawingml/2006/main" noChangeAspect="1"/>
+            </wp:cNvGraphicFramePr>
+            <a:graphic xmlns:a="http://schemas.openxmlformats.org/drawingml/2006/main">
+              <a:graphicData uri="http://schemas.openxmlformats.org/drawingml/2006/picture">
+                <pic:pic xmlns:pic="http://schemas.openxmlformats.org/drawingml/2006/picture">
+                  <pic:nvPicPr>
+                    <pic:cNvPr id="1146352224" name="Picture 1146352224"/>
+                    <pic:cNvPicPr/>
+                  </pic:nvPicPr>
+                  <pic:blipFill>
+                    <a:blip r:embed="rId18" cstate="print">
+                      <a:extLst>
+                        <a:ext uri="{28A0092B-C50C-407E-A947-70E740481C1C}">
+                          <a14:useLocalDpi xmlns:a14="http://schemas.microsoft.com/office/drawing/2010/main" val="0"/>
+                        </a:ext>
+                      </a:extLst>
+                    </a:blip>
+                    <a:stretch>
+                      <a:fillRect/>
+                    </a:stretch>
+                  </pic:blipFill>
+                  <pic:spPr>
+                    <a:xfrm>
+                      <a:off x="0" y="0"/>
+                      <a:ext cx="5754636" cy="4291593"/>
+                    </a:xfrm>
+                    <a:prstGeom prst="rect">
+                      <a:avLst/>
+                    </a:prstGeom>
+                  </pic:spPr>
+                </pic:pic>
+              </a:graphicData>
+            </a:graphic>
+          </wp:inline>
+        </w:drawing>
+      </w:r>
+    </w:p>
+    <w:p>
+      <w:pPr>
         <w:pStyle w:val="Heading3"/>
         <w:spacing w:before="220" w:after="120"/>
         <w:rPr>
@@ -2685,34 +3182,85 @@
           <w:sz w:val="24"/>
           <w:szCs w:val="24"/>
         </w:rPr>
-        <w:t xml:space="preserve">Log transformation reduced but did not fully normalize skew in several key features. A Yeo–Johnson power transform was applied instead to population, median income, EV charging density, EV adoption lag, and the target variable, producing more model-friendly (though still non-normal, block-shaped) distributions. Because Ridge regression's core requirement is normally distributed residuals — not normally distributed inputs — and Ridge's L2 penalty </w:t>
-      </w:r>
-      <w:r>
-        <w:rPr>
-          <w:rFonts w:ascii="Calibri" w:hAnsi="Calibri" w:cs="Calibri"/>
+        <w:t>Log transformation reduced but did not fully normalize skew in several key features. A Yeo–Johnson power transform was applied instead to population, median income, EV charging density, EV adoption lag, and the target variable, producing more model-friendly (though still non-normal, block-shaped) distributions. Because Ridge regression's core requirement is normally distributed residuals — not normally distributed inputs — and Ridge's L2 penalty stabilizes coefficients under non-normal feature distributions, this was judged acceptable. A variance inflation factor (VIF) check confirmed low multicollinearity across the retained feature set (all VIF values below 4.3).</w:t>
+      </w:r>
+    </w:p>
+    <w:p>
+      <w:pPr>
+        <w:spacing w:after="160"/>
+        <w:rPr>
+          <w:rFonts w:ascii="Calibri" w:hAnsi="Calibri" w:cs="Calibri"/>
+          <w:sz w:val="24"/>
+          <w:szCs w:val="24"/>
+        </w:rPr>
+      </w:pPr>
+      <w:r>
+        <w:rPr>
+          <w:rFonts w:ascii="Calibri" w:hAnsi="Calibri" w:cs="Calibri"/>
+          <w:sz w:val="24"/>
+          <w:szCs w:val="24"/>
+        </w:rPr>
+        <w:t>Weakly correlated or anomaly-prone features (income_per_vehicle, new_ev_purchase_ratio, bev_ratio_within_ev, cafv_eligibility_rate, ev_charging_stations, ev_growth_rate) were dropped from the modeling dataset, leaving a compact, low-collinearity feature set.</w:t>
+      </w:r>
+    </w:p>
+    <w:p>
+      <w:pPr>
+        <w:spacing w:after="160"/>
+        <w:rPr>
+          <w:rFonts w:ascii="Calibri" w:hAnsi="Calibri" w:cs="Calibri"/>
+          <w:sz w:val="24"/>
+          <w:szCs w:val="24"/>
+        </w:rPr>
+      </w:pPr>
+      <w:r>
+        <w:rPr>
+          <w:rFonts w:ascii="Calibri" w:hAnsi="Calibri" w:cs="Calibri"/>
+          <w:noProof/>
           <w:sz w:val="24"/>
           <w:szCs w:val="24"/>
         </w:rPr>
         <w:lastRenderedPageBreak/>
-        <w:t>stabilizes coefficients under non-normal feature distributions, this was judged acceptable. A variance inflation factor (VIF) check confirmed low multicollinearity across the retained feature set (all VIF values below 4.3).</w:t>
-      </w:r>
-    </w:p>
-    <w:p>
-      <w:pPr>
-        <w:spacing w:after="160"/>
-        <w:rPr>
-          <w:rFonts w:ascii="Calibri" w:hAnsi="Calibri" w:cs="Calibri"/>
-          <w:sz w:val="24"/>
-          <w:szCs w:val="24"/>
-        </w:rPr>
-      </w:pPr>
-      <w:r>
-        <w:rPr>
-          <w:rFonts w:ascii="Calibri" w:hAnsi="Calibri" w:cs="Calibri"/>
-          <w:sz w:val="24"/>
-          <w:szCs w:val="24"/>
-        </w:rPr>
-        <w:t>Weakly correlated or anomaly-prone features (income_per_vehicle, new_ev_purchase_ratio, bev_ratio_within_ev, cafv_eligibility_rate, ev_charging_stations, ev_growth_rate) were dropped from the modeling dataset, leaving a compact, low-collinearity feature set.</w:t>
+        <w:drawing>
+          <wp:inline distT="0" distB="0" distL="0" distR="0" wp14:anchorId="63EB8173" wp14:editId="23596B0A">
+            <wp:extent cx="5800356" cy="3343663"/>
+            <wp:effectExtent l="0" t="0" r="0" b="9525"/>
+            <wp:docPr id="126464502" name="Picture 13"/>
+            <wp:cNvGraphicFramePr>
+              <a:graphicFrameLocks xmlns:a="http://schemas.openxmlformats.org/drawingml/2006/main" noChangeAspect="1"/>
+            </wp:cNvGraphicFramePr>
+            <a:graphic xmlns:a="http://schemas.openxmlformats.org/drawingml/2006/main">
+              <a:graphicData uri="http://schemas.openxmlformats.org/drawingml/2006/picture">
+                <pic:pic xmlns:pic="http://schemas.openxmlformats.org/drawingml/2006/picture">
+                  <pic:nvPicPr>
+                    <pic:cNvPr id="126464502" name="Picture 126464502"/>
+                    <pic:cNvPicPr/>
+                  </pic:nvPicPr>
+                  <pic:blipFill>
+                    <a:blip r:embed="rId19" cstate="print">
+                      <a:extLst>
+                        <a:ext uri="{28A0092B-C50C-407E-A947-70E740481C1C}">
+                          <a14:useLocalDpi xmlns:a14="http://schemas.microsoft.com/office/drawing/2010/main" val="0"/>
+                        </a:ext>
+                      </a:extLst>
+                    </a:blip>
+                    <a:stretch>
+                      <a:fillRect/>
+                    </a:stretch>
+                  </pic:blipFill>
+                  <pic:spPr>
+                    <a:xfrm>
+                      <a:off x="0" y="0"/>
+                      <a:ext cx="5800356" cy="3343663"/>
+                    </a:xfrm>
+                    <a:prstGeom prst="rect">
+                      <a:avLst/>
+                    </a:prstGeom>
+                  </pic:spPr>
+                </pic:pic>
+              </a:graphicData>
+            </a:graphic>
+          </wp:inline>
+        </w:drawing>
       </w:r>
     </w:p>
     <w:p>
@@ -2855,15 +3403,7 @@
           <w:sz w:val="24"/>
           <w:szCs w:val="24"/>
         </w:rPr>
-        <w:t>Because the dataset is a county-year panel / time series, a time-aware split was used: training data covers 2017–2023 and test data covers 2024–2025 (an approximately 80/20 split). A random split was avoided to prevent future information from leaking into training. Numeric features were standardized with a StandardScaler fit on the training data only (for the regression set); no train/test split was applied for the unsupervised K-Means model, which used the full dataset with the adoption rate retained purel</w:t>
-      </w:r>
-      <w:r>
-        <w:rPr>
-          <w:rFonts w:ascii="Calibri" w:hAnsi="Calibri" w:cs="Calibri"/>
-          <w:sz w:val="24"/>
-          <w:szCs w:val="24"/>
-        </w:rPr>
-        <w:t>y as a post-hoc interpretive label.</w:t>
+        <w:t>Because the dataset is a county-year panel / time series, a time-aware split was used: training data covers 2017–2023 and test data covers 2024–2025 (an approximately 80/20 split). A random split was avoided to prevent future information from leaking into training. Numeric features were standardized with a StandardScaler fit on the training data only (for the regression set); no train/test split was applied for the unsupervised K-Means model, which used the full dataset with the adoption rate retained purely as a post-hoc interpretive label.</w:t>
       </w:r>
     </w:p>
     <w:p>
@@ -2939,7 +3479,16 @@
           <w:sz w:val="24"/>
           <w:szCs w:val="24"/>
         </w:rPr>
-        <w:t xml:space="preserve"> Ridge's L2 regularization reduces overfitting risk while retaining all features (as opposed to Lasso, which can zero out coefficients entirely). The regularization strength (alpha) was tuned via GridSearchCV using TimeSeriesSplit cross-validation (5 folds) to respect the temporal structure of the data and avoid leakage across folds.</w:t>
+        <w:t xml:space="preserve"> Ridge's L2 regularization reduces overfitting risk while retaining all features (as </w:t>
+      </w:r>
+      <w:r>
+        <w:rPr>
+          <w:rFonts w:ascii="Calibri" w:hAnsi="Calibri" w:cs="Calibri"/>
+          <w:sz w:val="24"/>
+          <w:szCs w:val="24"/>
+        </w:rPr>
+        <w:lastRenderedPageBreak/>
+        <w:t>opposed to Lasso, which can zero out coefficients entirely). The regularization strength (alpha) was tuned via GridSearchCV using TimeSeriesSplit cross-validation (5 folds) to respect the temporal structure of the data and avoid leakage across folds.</w:t>
       </w:r>
     </w:p>
     <w:p>
@@ -3022,7 +3571,6 @@
           <w:sz w:val="24"/>
           <w:szCs w:val="24"/>
         </w:rPr>
-        <w:lastRenderedPageBreak/>
         <w:t>4.1 Ridge Regression: Adoption Drivers</w:t>
       </w:r>
     </w:p>
@@ -3510,6 +4058,66 @@
     </w:p>
     <w:p>
       <w:pPr>
+        <w:spacing w:after="80"/>
+        <w:rPr>
+          <w:rFonts w:ascii="Calibri" w:hAnsi="Calibri" w:cs="Calibri"/>
+          <w:sz w:val="24"/>
+          <w:szCs w:val="24"/>
+        </w:rPr>
+      </w:pPr>
+      <w:r>
+        <w:rPr>
+          <w:rFonts w:ascii="Calibri" w:hAnsi="Calibri" w:cs="Calibri"/>
+          <w:noProof/>
+          <w:sz w:val="24"/>
+          <w:szCs w:val="24"/>
+        </w:rPr>
+        <w:lastRenderedPageBreak/>
+        <w:drawing>
+          <wp:inline distT="0" distB="0" distL="0" distR="0" wp14:anchorId="74D79282" wp14:editId="72438530">
+            <wp:extent cx="5760732" cy="4300737"/>
+            <wp:effectExtent l="0" t="0" r="0" b="5080"/>
+            <wp:docPr id="1616656889" name="Picture 14"/>
+            <wp:cNvGraphicFramePr>
+              <a:graphicFrameLocks xmlns:a="http://schemas.openxmlformats.org/drawingml/2006/main" noChangeAspect="1"/>
+            </wp:cNvGraphicFramePr>
+            <a:graphic xmlns:a="http://schemas.openxmlformats.org/drawingml/2006/main">
+              <a:graphicData uri="http://schemas.openxmlformats.org/drawingml/2006/picture">
+                <pic:pic xmlns:pic="http://schemas.openxmlformats.org/drawingml/2006/picture">
+                  <pic:nvPicPr>
+                    <pic:cNvPr id="1616656889" name="Picture 1616656889"/>
+                    <pic:cNvPicPr/>
+                  </pic:nvPicPr>
+                  <pic:blipFill>
+                    <a:blip r:embed="rId20" cstate="print">
+                      <a:extLst>
+                        <a:ext uri="{28A0092B-C50C-407E-A947-70E740481C1C}">
+                          <a14:useLocalDpi xmlns:a14="http://schemas.microsoft.com/office/drawing/2010/main" val="0"/>
+                        </a:ext>
+                      </a:extLst>
+                    </a:blip>
+                    <a:stretch>
+                      <a:fillRect/>
+                    </a:stretch>
+                  </pic:blipFill>
+                  <pic:spPr>
+                    <a:xfrm>
+                      <a:off x="0" y="0"/>
+                      <a:ext cx="5760732" cy="4300737"/>
+                    </a:xfrm>
+                    <a:prstGeom prst="rect">
+                      <a:avLst/>
+                    </a:prstGeom>
+                  </pic:spPr>
+                </pic:pic>
+              </a:graphicData>
+            </a:graphic>
+          </wp:inline>
+        </w:drawing>
+      </w:r>
+    </w:p>
+    <w:p>
+      <w:pPr>
         <w:spacing w:after="160"/>
         <w:rPr>
           <w:rFonts w:ascii="Calibri" w:hAnsi="Calibri" w:cs="Calibri"/>
@@ -3540,6 +4148,126 @@
           <w:szCs w:val="24"/>
         </w:rPr>
         <w:t xml:space="preserve"> the model captures the dominant signal well and provides a decent fit.</w:t>
+      </w:r>
+    </w:p>
+    <w:p>
+      <w:pPr>
+        <w:spacing w:after="160"/>
+        <w:rPr>
+          <w:rFonts w:ascii="Calibri" w:hAnsi="Calibri" w:cs="Calibri"/>
+          <w:sz w:val="24"/>
+          <w:szCs w:val="24"/>
+        </w:rPr>
+      </w:pPr>
+      <w:r>
+        <w:rPr>
+          <w:rFonts w:ascii="Calibri" w:hAnsi="Calibri" w:cs="Calibri"/>
+          <w:noProof/>
+          <w:sz w:val="24"/>
+          <w:szCs w:val="24"/>
+        </w:rPr>
+        <w:lastRenderedPageBreak/>
+        <w:drawing>
+          <wp:inline distT="0" distB="0" distL="0" distR="0" wp14:anchorId="325F4272" wp14:editId="05C518C2">
+            <wp:extent cx="5218187" cy="4117856"/>
+            <wp:effectExtent l="0" t="0" r="1905" b="0"/>
+            <wp:docPr id="1706999989" name="Picture 16"/>
+            <wp:cNvGraphicFramePr>
+              <a:graphicFrameLocks xmlns:a="http://schemas.openxmlformats.org/drawingml/2006/main" noChangeAspect="1"/>
+            </wp:cNvGraphicFramePr>
+            <a:graphic xmlns:a="http://schemas.openxmlformats.org/drawingml/2006/main">
+              <a:graphicData uri="http://schemas.openxmlformats.org/drawingml/2006/picture">
+                <pic:pic xmlns:pic="http://schemas.openxmlformats.org/drawingml/2006/picture">
+                  <pic:nvPicPr>
+                    <pic:cNvPr id="1706999989" name="Picture 1706999989"/>
+                    <pic:cNvPicPr/>
+                  </pic:nvPicPr>
+                  <pic:blipFill>
+                    <a:blip r:embed="rId21" cstate="print">
+                      <a:extLst>
+                        <a:ext uri="{28A0092B-C50C-407E-A947-70E740481C1C}">
+                          <a14:useLocalDpi xmlns:a14="http://schemas.microsoft.com/office/drawing/2010/main" val="0"/>
+                        </a:ext>
+                      </a:extLst>
+                    </a:blip>
+                    <a:stretch>
+                      <a:fillRect/>
+                    </a:stretch>
+                  </pic:blipFill>
+                  <pic:spPr>
+                    <a:xfrm>
+                      <a:off x="0" y="0"/>
+                      <a:ext cx="5218187" cy="4117856"/>
+                    </a:xfrm>
+                    <a:prstGeom prst="rect">
+                      <a:avLst/>
+                    </a:prstGeom>
+                  </pic:spPr>
+                </pic:pic>
+              </a:graphicData>
+            </a:graphic>
+          </wp:inline>
+        </w:drawing>
+      </w:r>
+    </w:p>
+    <w:p>
+      <w:pPr>
+        <w:spacing w:after="160"/>
+        <w:rPr>
+          <w:rFonts w:ascii="Calibri" w:hAnsi="Calibri" w:cs="Calibri"/>
+          <w:sz w:val="24"/>
+          <w:szCs w:val="24"/>
+        </w:rPr>
+      </w:pPr>
+      <w:r>
+        <w:rPr>
+          <w:rFonts w:ascii="Calibri" w:hAnsi="Calibri" w:cs="Calibri"/>
+          <w:noProof/>
+          <w:sz w:val="24"/>
+          <w:szCs w:val="24"/>
+        </w:rPr>
+        <w:lastRenderedPageBreak/>
+        <w:drawing>
+          <wp:inline distT="0" distB="0" distL="0" distR="0" wp14:anchorId="673F7480" wp14:editId="2598CED5">
+            <wp:extent cx="5221235" cy="4117856"/>
+            <wp:effectExtent l="0" t="0" r="0" b="0"/>
+            <wp:docPr id="935349034" name="Picture 15"/>
+            <wp:cNvGraphicFramePr>
+              <a:graphicFrameLocks xmlns:a="http://schemas.openxmlformats.org/drawingml/2006/main" noChangeAspect="1"/>
+            </wp:cNvGraphicFramePr>
+            <a:graphic xmlns:a="http://schemas.openxmlformats.org/drawingml/2006/main">
+              <a:graphicData uri="http://schemas.openxmlformats.org/drawingml/2006/picture">
+                <pic:pic xmlns:pic="http://schemas.openxmlformats.org/drawingml/2006/picture">
+                  <pic:nvPicPr>
+                    <pic:cNvPr id="935349034" name="Picture 935349034"/>
+                    <pic:cNvPicPr/>
+                  </pic:nvPicPr>
+                  <pic:blipFill>
+                    <a:blip r:embed="rId22" cstate="print">
+                      <a:extLst>
+                        <a:ext uri="{28A0092B-C50C-407E-A947-70E740481C1C}">
+                          <a14:useLocalDpi xmlns:a14="http://schemas.microsoft.com/office/drawing/2010/main" val="0"/>
+                        </a:ext>
+                      </a:extLst>
+                    </a:blip>
+                    <a:stretch>
+                      <a:fillRect/>
+                    </a:stretch>
+                  </pic:blipFill>
+                  <pic:spPr>
+                    <a:xfrm>
+                      <a:off x="0" y="0"/>
+                      <a:ext cx="5221235" cy="4117856"/>
+                    </a:xfrm>
+                    <a:prstGeom prst="rect">
+                      <a:avLst/>
+                    </a:prstGeom>
+                  </pic:spPr>
+                </pic:pic>
+              </a:graphicData>
+            </a:graphic>
+          </wp:inline>
+        </w:drawing>
       </w:r>
     </w:p>
     <w:p>
@@ -4032,16 +4760,7 @@
                 <w:sz w:val="24"/>
                 <w:szCs w:val="24"/>
               </w:rPr>
-              <w:t xml:space="preserve">Lower income, lower </w:t>
-            </w:r>
-            <w:r>
-              <w:rPr>
-                <w:rFonts w:ascii="Calibri" w:hAnsi="Calibri" w:cs="Calibri"/>
-                <w:sz w:val="24"/>
-                <w:szCs w:val="24"/>
-              </w:rPr>
-              <w:lastRenderedPageBreak/>
-              <w:t>population, but strong public charging density</w:t>
+              <w:t>Lower income, lower population, but strong public charging density</w:t>
             </w:r>
           </w:p>
         </w:tc>
@@ -4242,6 +4961,125 @@
     </w:p>
     <w:p>
       <w:pPr>
+        <w:spacing w:after="160"/>
+        <w:rPr>
+          <w:rFonts w:ascii="Calibri" w:hAnsi="Calibri" w:cs="Calibri"/>
+          <w:sz w:val="24"/>
+          <w:szCs w:val="24"/>
+        </w:rPr>
+      </w:pPr>
+      <w:r>
+        <w:rPr>
+          <w:rFonts w:ascii="Calibri" w:hAnsi="Calibri" w:cs="Calibri"/>
+          <w:noProof/>
+          <w:sz w:val="24"/>
+          <w:szCs w:val="24"/>
+        </w:rPr>
+        <w:drawing>
+          <wp:inline distT="0" distB="0" distL="0" distR="0" wp14:anchorId="21D2CE2A" wp14:editId="473EF345">
+            <wp:extent cx="5943600" cy="4128135"/>
+            <wp:effectExtent l="0" t="0" r="0" b="5715"/>
+            <wp:docPr id="215494919" name="Picture 17"/>
+            <wp:cNvGraphicFramePr>
+              <a:graphicFrameLocks xmlns:a="http://schemas.openxmlformats.org/drawingml/2006/main" noChangeAspect="1"/>
+            </wp:cNvGraphicFramePr>
+            <a:graphic xmlns:a="http://schemas.openxmlformats.org/drawingml/2006/main">
+              <a:graphicData uri="http://schemas.openxmlformats.org/drawingml/2006/picture">
+                <pic:pic xmlns:pic="http://schemas.openxmlformats.org/drawingml/2006/picture">
+                  <pic:nvPicPr>
+                    <pic:cNvPr id="215494919" name="Picture 215494919"/>
+                    <pic:cNvPicPr/>
+                  </pic:nvPicPr>
+                  <pic:blipFill>
+                    <a:blip r:embed="rId23" cstate="print">
+                      <a:extLst>
+                        <a:ext uri="{28A0092B-C50C-407E-A947-70E740481C1C}">
+                          <a14:useLocalDpi xmlns:a14="http://schemas.microsoft.com/office/drawing/2010/main" val="0"/>
+                        </a:ext>
+                      </a:extLst>
+                    </a:blip>
+                    <a:stretch>
+                      <a:fillRect/>
+                    </a:stretch>
+                  </pic:blipFill>
+                  <pic:spPr>
+                    <a:xfrm>
+                      <a:off x="0" y="0"/>
+                      <a:ext cx="5943600" cy="4128135"/>
+                    </a:xfrm>
+                    <a:prstGeom prst="rect">
+                      <a:avLst/>
+                    </a:prstGeom>
+                  </pic:spPr>
+                </pic:pic>
+              </a:graphicData>
+            </a:graphic>
+          </wp:inline>
+        </w:drawing>
+      </w:r>
+    </w:p>
+    <w:p>
+      <w:pPr>
+        <w:spacing w:after="160"/>
+        <w:rPr>
+          <w:rFonts w:ascii="Calibri" w:hAnsi="Calibri" w:cs="Calibri"/>
+          <w:sz w:val="24"/>
+          <w:szCs w:val="24"/>
+        </w:rPr>
+      </w:pPr>
+      <w:r>
+        <w:rPr>
+          <w:rFonts w:ascii="Calibri" w:hAnsi="Calibri" w:cs="Calibri"/>
+          <w:noProof/>
+          <w:sz w:val="24"/>
+          <w:szCs w:val="24"/>
+        </w:rPr>
+        <w:lastRenderedPageBreak/>
+        <w:drawing>
+          <wp:inline distT="0" distB="0" distL="0" distR="0" wp14:anchorId="065A3B08" wp14:editId="424AB643">
+            <wp:extent cx="5943600" cy="2967355"/>
+            <wp:effectExtent l="0" t="0" r="0" b="4445"/>
+            <wp:docPr id="1299681376" name="Picture 18"/>
+            <wp:cNvGraphicFramePr>
+              <a:graphicFrameLocks xmlns:a="http://schemas.openxmlformats.org/drawingml/2006/main" noChangeAspect="1"/>
+            </wp:cNvGraphicFramePr>
+            <a:graphic xmlns:a="http://schemas.openxmlformats.org/drawingml/2006/main">
+              <a:graphicData uri="http://schemas.openxmlformats.org/drawingml/2006/picture">
+                <pic:pic xmlns:pic="http://schemas.openxmlformats.org/drawingml/2006/picture">
+                  <pic:nvPicPr>
+                    <pic:cNvPr id="1299681376" name="Picture 1299681376"/>
+                    <pic:cNvPicPr/>
+                  </pic:nvPicPr>
+                  <pic:blipFill>
+                    <a:blip r:embed="rId24" cstate="print">
+                      <a:extLst>
+                        <a:ext uri="{28A0092B-C50C-407E-A947-70E740481C1C}">
+                          <a14:useLocalDpi xmlns:a14="http://schemas.microsoft.com/office/drawing/2010/main" val="0"/>
+                        </a:ext>
+                      </a:extLst>
+                    </a:blip>
+                    <a:stretch>
+                      <a:fillRect/>
+                    </a:stretch>
+                  </pic:blipFill>
+                  <pic:spPr>
+                    <a:xfrm>
+                      <a:off x="0" y="0"/>
+                      <a:ext cx="5943600" cy="2967355"/>
+                    </a:xfrm>
+                    <a:prstGeom prst="rect">
+                      <a:avLst/>
+                    </a:prstGeom>
+                  </pic:spPr>
+                </pic:pic>
+              </a:graphicData>
+            </a:graphic>
+          </wp:inline>
+        </w:drawing>
+      </w:r>
+    </w:p>
+    <w:p>
+      <w:pPr>
         <w:pStyle w:val="Heading2"/>
         <w:spacing w:before="280" w:after="140"/>
         <w:rPr>
@@ -4345,15 +5183,7 @@
           <w:sz w:val="24"/>
           <w:szCs w:val="24"/>
         </w:rPr>
-        <w:t xml:space="preserve">zero infrastructure and low population, </w:t>
-      </w:r>
-      <w:r>
-        <w:rPr>
-          <w:rFonts w:ascii="Calibri" w:hAnsi="Calibri" w:cs="Calibri"/>
-          <w:sz w:val="24"/>
-          <w:szCs w:val="24"/>
-        </w:rPr>
-        <w:t>adoption remains near a structural floor</w:t>
+        <w:t>zero infrastructure and low population, adoption remains near a structural floor</w:t>
       </w:r>
       <w:r>
         <w:rPr>
@@ -4469,7 +5299,6 @@
                 <w:sz w:val="24"/>
                 <w:szCs w:val="24"/>
               </w:rPr>
-              <w:lastRenderedPageBreak/>
               <w:t>Phase</w:t>
             </w:r>
           </w:p>
@@ -4790,7 +5619,16 @@
                 <w:sz w:val="24"/>
                 <w:szCs w:val="24"/>
               </w:rPr>
-              <w:t>, and other lower-income, infrastructure-rich counties)</w:t>
+              <w:t xml:space="preserve">, and </w:t>
+            </w:r>
+            <w:r>
+              <w:rPr>
+                <w:rFonts w:ascii="Calibri" w:hAnsi="Calibri" w:cs="Calibri"/>
+                <w:sz w:val="24"/>
+                <w:szCs w:val="24"/>
+              </w:rPr>
+              <w:lastRenderedPageBreak/>
+              <w:t>other lower-income, infrastructure-rich counties)</w:t>
             </w:r>
           </w:p>
         </w:tc>
@@ -4812,7 +5650,17 @@
                 <w:sz w:val="24"/>
                 <w:szCs w:val="24"/>
               </w:rPr>
-              <w:t>Vehicle purchase rebates and used-BEV subsidies to unlock pent-up demand; maintain and enforce DC fast-charger uptime reliability</w:t>
+              <w:lastRenderedPageBreak/>
+              <w:t xml:space="preserve">Vehicle purchase rebates and used-BEV subsidies to unlock pent-up demand; maintain </w:t>
+            </w:r>
+            <w:r>
+              <w:rPr>
+                <w:rFonts w:ascii="Calibri" w:hAnsi="Calibri" w:cs="Calibri"/>
+                <w:sz w:val="24"/>
+                <w:szCs w:val="24"/>
+              </w:rPr>
+              <w:lastRenderedPageBreak/>
+              <w:t>and enforce DC fast-charger uptime reliability</w:t>
             </w:r>
           </w:p>
         </w:tc>
@@ -4834,7 +5682,17 @@
                 <w:sz w:val="24"/>
                 <w:szCs w:val="24"/>
               </w:rPr>
-              <w:t>Point-of-sale rebates, used-BEV subsidies, public–private matching funds</w:t>
+              <w:lastRenderedPageBreak/>
+              <w:t xml:space="preserve">Point-of-sale rebates, used-BEV subsidies, </w:t>
+            </w:r>
+            <w:r>
+              <w:rPr>
+                <w:rFonts w:ascii="Calibri" w:hAnsi="Calibri" w:cs="Calibri"/>
+                <w:sz w:val="24"/>
+                <w:szCs w:val="24"/>
+              </w:rPr>
+              <w:lastRenderedPageBreak/>
+              <w:t>public–private matching funds</w:t>
             </w:r>
           </w:p>
         </w:tc>
@@ -4864,6 +5722,7 @@
                 <w:sz w:val="24"/>
                 <w:szCs w:val="24"/>
               </w:rPr>
+              <w:lastRenderedPageBreak/>
               <w:t>3 — Autonomy</w:t>
             </w:r>
           </w:p>
@@ -5250,7 +6109,6 @@
           <w:sz w:val="24"/>
           <w:szCs w:val="24"/>
         </w:rPr>
-        <w:lastRenderedPageBreak/>
         <w:t xml:space="preserve">Geographic generalization: </w:t>
       </w:r>
       <w:r>
@@ -5315,6 +6173,7 @@
           <w:sz w:val="24"/>
           <w:szCs w:val="24"/>
         </w:rPr>
+        <w:lastRenderedPageBreak/>
         <w:t xml:space="preserve">Charging infrastructure </w:t>
       </w:r>
       <w:proofErr w:type="gramStart"/>
@@ -5531,15 +6390,7 @@
           <w:sz w:val="24"/>
           <w:szCs w:val="24"/>
         </w:rPr>
-        <w:t xml:space="preserve">This project delivers a reusable, data-driven framework for identifying and prioritizing high-impact regions for EV infrastructure investment. The Ridge regression model quantifies which factors drive county-level adoption — prior adoption momentum, income, and infrastructure, in that order of importance — while the K-Means clustering model translates those drivers into three actionable policy segments. Together, they support a phased, funding-mechanism-specific deployment strategy that concentrates scarce </w:t>
-      </w:r>
-      <w:r>
-        <w:rPr>
-          <w:rFonts w:ascii="Calibri" w:hAnsi="Calibri" w:cs="Calibri"/>
-          <w:sz w:val="24"/>
-          <w:szCs w:val="24"/>
-        </w:rPr>
-        <w:t xml:space="preserve">public capital where it will have the greatest impact, while allowing private capital to scale adoption in </w:t>
+        <w:t xml:space="preserve">This project delivers a reusable, data-driven framework for identifying and prioritizing high-impact regions for EV infrastructure investment. The Ridge regression model quantifies which factors drive county-level adoption — prior adoption momentum, income, and infrastructure, in that order of importance — while the K-Means clustering model translates those drivers into three actionable policy segments. Together, they support a phased, funding-mechanism-specific deployment strategy that concentrates scarce public capital where it will have the greatest impact, while allowing private capital to scale adoption in </w:t>
       </w:r>
       <w:r>
         <w:rPr>

</xml_diff>

<commit_message>
Update ReadMe and Project Report Files
</commit_message>
<xml_diff>
--- a/Data Science Capstone 3 Project/reports/Data_Science_Capstone_3_EV_Adoption_Project_Report.docx
+++ b/Data Science Capstone 3 Project/reports/Data_Science_Capstone_3_EV_Adoption_Project_Report.docx
@@ -76,27 +76,7 @@
           <w:sz w:val="24"/>
           <w:szCs w:val="24"/>
         </w:rPr>
-        <w:t>Springboard Capstone II</w:t>
-      </w:r>
-      <w:r>
-        <w:rPr>
-          <w:rFonts w:ascii="Calibri" w:hAnsi="Calibri" w:cs="Calibri"/>
-          <w:i/>
-          <w:iCs/>
-          <w:sz w:val="24"/>
-          <w:szCs w:val="24"/>
-        </w:rPr>
-        <w:t>I</w:t>
-      </w:r>
-      <w:r>
-        <w:rPr>
-          <w:rFonts w:ascii="Calibri" w:hAnsi="Calibri" w:cs="Calibri"/>
-          <w:i/>
-          <w:iCs/>
-          <w:sz w:val="24"/>
-          <w:szCs w:val="24"/>
-        </w:rPr>
-        <w:t xml:space="preserve"> Project Report</w:t>
+        <w:t>Springboard Capstone III Project Report</w:t>
       </w:r>
     </w:p>
     <w:p>
@@ -192,7 +172,15 @@
           <w:sz w:val="24"/>
           <w:szCs w:val="24"/>
         </w:rPr>
-        <w:t xml:space="preserve">Two complementary models were built on a merged 2017–2025 county-year dataset spanning 39 Washington counties: a Ridge regression model to quantify drivers of EV adoption rate, and a K-Means clustering model to segment counties by adoption profile. The Ridge model explained approximately 96% of the variance in (transformed) adoption rate on a held-out 2024–2025 test set, with prior-year adoption momentum, median income, and charging infrastructure density emerging as the strongest predictors, in that order. The clustering model identified three distinct county segments — a high-income/high-adoption group, a </w:t>
+        <w:t>Two complementary models were built on a merged 2017–2025 county-year dataset spanning 39 Washington counties: a Ridge regression model to quantify drivers of EV adoption rate, and a K-Means clustering model to segment counties by adoption profile. The Ridge model explained approximately 96% of the variance in (transformed) adoption rate on a held-out 2024–2025 test set, with prior-year adoption momentum, median income, and charging infrastructure density emerging as the strongest predictors, in that order.</w:t>
+      </w:r>
+      <w:r>
+        <w:rPr>
+          <w:rFonts w:ascii="Calibri" w:hAnsi="Calibri" w:cs="Calibri"/>
+          <w:sz w:val="24"/>
+          <w:szCs w:val="24"/>
+        </w:rPr>
+        <w:t xml:space="preserve"> The clustering model identified three distinct county segments — a high-income/high-adoption group, a </w:t>
       </w:r>
       <w:r>
         <w:rPr>
@@ -692,15 +680,7 @@
           <w:sz w:val="24"/>
           <w:szCs w:val="24"/>
         </w:rPr>
-        <w:t>F</w:t>
-      </w:r>
-      <w:r>
-        <w:rPr>
-          <w:rFonts w:ascii="Calibri" w:hAnsi="Calibri" w:cs="Calibri"/>
-          <w:sz w:val="24"/>
-          <w:szCs w:val="24"/>
-        </w:rPr>
-        <w:t xml:space="preserve">eature engineering and target variable construction, </w:t>
+        <w:t xml:space="preserve">Feature engineering and target variable construction, </w:t>
       </w:r>
     </w:p>
     <w:p>
@@ -723,15 +703,7 @@
           <w:sz w:val="24"/>
           <w:szCs w:val="24"/>
         </w:rPr>
-        <w:t>R</w:t>
-      </w:r>
-      <w:r>
-        <w:rPr>
-          <w:rFonts w:ascii="Calibri" w:hAnsi="Calibri" w:cs="Calibri"/>
-          <w:sz w:val="24"/>
-          <w:szCs w:val="24"/>
-        </w:rPr>
-        <w:t>egional EV adoption analysis</w:t>
+        <w:t>Regional EV adoption analysis</w:t>
       </w:r>
     </w:p>
     <w:p>
@@ -754,15 +726,7 @@
           <w:sz w:val="24"/>
           <w:szCs w:val="24"/>
         </w:rPr>
-        <w:t>P</w:t>
-      </w:r>
-      <w:r>
-        <w:rPr>
-          <w:rFonts w:ascii="Calibri" w:hAnsi="Calibri" w:cs="Calibri"/>
-          <w:sz w:val="24"/>
-          <w:szCs w:val="24"/>
-        </w:rPr>
-        <w:t>redictive modeling of adoption potential, county segmentation</w:t>
+        <w:t>Predictive modeling of adoption potential, county segmentation</w:t>
       </w:r>
     </w:p>
     <w:p>
@@ -785,15 +749,7 @@
           <w:sz w:val="24"/>
           <w:szCs w:val="24"/>
         </w:rPr>
-        <w:t>B</w:t>
-      </w:r>
-      <w:r>
-        <w:rPr>
-          <w:rFonts w:ascii="Calibri" w:hAnsi="Calibri" w:cs="Calibri"/>
-          <w:sz w:val="24"/>
-          <w:szCs w:val="24"/>
-        </w:rPr>
-        <w:t xml:space="preserve">usiness recommendation framework. </w:t>
+        <w:t xml:space="preserve">Business recommendation framework. </w:t>
       </w:r>
     </w:p>
     <w:p>
@@ -834,15 +790,7 @@
           <w:sz w:val="24"/>
           <w:szCs w:val="24"/>
         </w:rPr>
-        <w:t>I</w:t>
-      </w:r>
-      <w:r>
-        <w:rPr>
-          <w:rFonts w:ascii="Calibri" w:hAnsi="Calibri" w:cs="Calibri"/>
-          <w:sz w:val="24"/>
-          <w:szCs w:val="24"/>
-        </w:rPr>
-        <w:t xml:space="preserve">ndividual consumer-level behavior modeling (not available in the data) and </w:t>
+        <w:t xml:space="preserve">Individual consumer-level behavior modeling (not available in the data) and </w:t>
       </w:r>
     </w:p>
     <w:p>
@@ -865,15 +813,7 @@
           <w:sz w:val="24"/>
           <w:szCs w:val="24"/>
         </w:rPr>
-        <w:t>C</w:t>
-      </w:r>
-      <w:r>
-        <w:rPr>
-          <w:rFonts w:ascii="Calibri" w:hAnsi="Calibri" w:cs="Calibri"/>
-          <w:sz w:val="24"/>
-          <w:szCs w:val="24"/>
-        </w:rPr>
-        <w:t>harging network route-level optimization.</w:t>
+        <w:t>Charging network route-level optimization.</w:t>
       </w:r>
     </w:p>
     <w:p>
@@ -1077,12 +1017,6 @@
         <w:gridCol w:w="5800"/>
       </w:tblGrid>
       <w:tr>
-        <w:tblPrEx>
-          <w:tblCellMar>
-            <w:top w:w="0" w:type="dxa"/>
-            <w:bottom w:w="0" w:type="dxa"/>
-          </w:tblCellMar>
-        </w:tblPrEx>
         <w:trPr>
           <w:tblHeader/>
         </w:trPr>
@@ -1140,12 +1074,6 @@
         </w:tc>
       </w:tr>
       <w:tr>
-        <w:tblPrEx>
-          <w:tblCellMar>
-            <w:top w:w="0" w:type="dxa"/>
-            <w:bottom w:w="0" w:type="dxa"/>
-          </w:tblCellMar>
-        </w:tblPrEx>
         <w:tc>
           <w:tcPr>
             <w:tcW w:w="4200" w:type="dxa"/>
@@ -1203,12 +1131,6 @@
         </w:tc>
       </w:tr>
       <w:tr>
-        <w:tblPrEx>
-          <w:tblCellMar>
-            <w:top w:w="0" w:type="dxa"/>
-            <w:bottom w:w="0" w:type="dxa"/>
-          </w:tblCellMar>
-        </w:tblPrEx>
         <w:tc>
           <w:tcPr>
             <w:tcW w:w="4200" w:type="dxa"/>
@@ -1266,12 +1188,6 @@
         </w:tc>
       </w:tr>
       <w:tr>
-        <w:tblPrEx>
-          <w:tblCellMar>
-            <w:top w:w="0" w:type="dxa"/>
-            <w:bottom w:w="0" w:type="dxa"/>
-          </w:tblCellMar>
-        </w:tblPrEx>
         <w:tc>
           <w:tcPr>
             <w:tcW w:w="4200" w:type="dxa"/>
@@ -1329,12 +1245,6 @@
         </w:tc>
       </w:tr>
       <w:tr>
-        <w:tblPrEx>
-          <w:tblCellMar>
-            <w:top w:w="0" w:type="dxa"/>
-            <w:bottom w:w="0" w:type="dxa"/>
-          </w:tblCellMar>
-        </w:tblPrEx>
         <w:tc>
           <w:tcPr>
             <w:tcW w:w="4200" w:type="dxa"/>
@@ -1404,12 +1314,6 @@
         </w:tc>
       </w:tr>
       <w:tr>
-        <w:tblPrEx>
-          <w:tblCellMar>
-            <w:top w:w="0" w:type="dxa"/>
-            <w:bottom w:w="0" w:type="dxa"/>
-          </w:tblCellMar>
-        </w:tblPrEx>
         <w:tc>
           <w:tcPr>
             <w:tcW w:w="4200" w:type="dxa"/>
@@ -2235,12 +2139,6 @@
         <w:gridCol w:w="5800"/>
       </w:tblGrid>
       <w:tr>
-        <w:tblPrEx>
-          <w:tblCellMar>
-            <w:top w:w="0" w:type="dxa"/>
-            <w:bottom w:w="0" w:type="dxa"/>
-          </w:tblCellMar>
-        </w:tblPrEx>
         <w:trPr>
           <w:tblHeader/>
         </w:trPr>
@@ -2298,12 +2196,6 @@
         </w:tc>
       </w:tr>
       <w:tr>
-        <w:tblPrEx>
-          <w:tblCellMar>
-            <w:top w:w="0" w:type="dxa"/>
-            <w:bottom w:w="0" w:type="dxa"/>
-          </w:tblCellMar>
-        </w:tblPrEx>
         <w:tc>
           <w:tcPr>
             <w:tcW w:w="4200" w:type="dxa"/>
@@ -2350,12 +2242,6 @@
         </w:tc>
       </w:tr>
       <w:tr>
-        <w:tblPrEx>
-          <w:tblCellMar>
-            <w:top w:w="0" w:type="dxa"/>
-            <w:bottom w:w="0" w:type="dxa"/>
-          </w:tblCellMar>
-        </w:tblPrEx>
         <w:tc>
           <w:tcPr>
             <w:tcW w:w="4200" w:type="dxa"/>
@@ -2402,12 +2288,6 @@
         </w:tc>
       </w:tr>
       <w:tr>
-        <w:tblPrEx>
-          <w:tblCellMar>
-            <w:top w:w="0" w:type="dxa"/>
-            <w:bottom w:w="0" w:type="dxa"/>
-          </w:tblCellMar>
-        </w:tblPrEx>
         <w:tc>
           <w:tcPr>
             <w:tcW w:w="4200" w:type="dxa"/>
@@ -2454,12 +2334,6 @@
         </w:tc>
       </w:tr>
       <w:tr>
-        <w:tblPrEx>
-          <w:tblCellMar>
-            <w:top w:w="0" w:type="dxa"/>
-            <w:bottom w:w="0" w:type="dxa"/>
-          </w:tblCellMar>
-        </w:tblPrEx>
         <w:tc>
           <w:tcPr>
             <w:tcW w:w="4200" w:type="dxa"/>
@@ -2506,12 +2380,6 @@
         </w:tc>
       </w:tr>
       <w:tr>
-        <w:tblPrEx>
-          <w:tblCellMar>
-            <w:top w:w="0" w:type="dxa"/>
-            <w:bottom w:w="0" w:type="dxa"/>
-          </w:tblCellMar>
-        </w:tblPrEx>
         <w:tc>
           <w:tcPr>
             <w:tcW w:w="4200" w:type="dxa"/>
@@ -2558,12 +2426,6 @@
         </w:tc>
       </w:tr>
       <w:tr>
-        <w:tblPrEx>
-          <w:tblCellMar>
-            <w:top w:w="0" w:type="dxa"/>
-            <w:bottom w:w="0" w:type="dxa"/>
-          </w:tblCellMar>
-        </w:tblPrEx>
         <w:tc>
           <w:tcPr>
             <w:tcW w:w="4200" w:type="dxa"/>
@@ -2610,12 +2472,6 @@
         </w:tc>
       </w:tr>
       <w:tr>
-        <w:tblPrEx>
-          <w:tblCellMar>
-            <w:top w:w="0" w:type="dxa"/>
-            <w:bottom w:w="0" w:type="dxa"/>
-          </w:tblCellMar>
-        </w:tblPrEx>
         <w:tc>
           <w:tcPr>
             <w:tcW w:w="4200" w:type="dxa"/>
@@ -2662,12 +2518,6 @@
         </w:tc>
       </w:tr>
       <w:tr>
-        <w:tblPrEx>
-          <w:tblCellMar>
-            <w:top w:w="0" w:type="dxa"/>
-            <w:bottom w:w="0" w:type="dxa"/>
-          </w:tblCellMar>
-        </w:tblPrEx>
         <w:tc>
           <w:tcPr>
             <w:tcW w:w="4200" w:type="dxa"/>
@@ -2714,12 +2564,6 @@
         </w:tc>
       </w:tr>
       <w:tr>
-        <w:tblPrEx>
-          <w:tblCellMar>
-            <w:top w:w="0" w:type="dxa"/>
-            <w:bottom w:w="0" w:type="dxa"/>
-          </w:tblCellMar>
-        </w:tblPrEx>
         <w:tc>
           <w:tcPr>
             <w:tcW w:w="4200" w:type="dxa"/>
@@ -2782,12 +2626,6 @@
         </w:tc>
       </w:tr>
       <w:tr>
-        <w:tblPrEx>
-          <w:tblCellMar>
-            <w:top w:w="0" w:type="dxa"/>
-            <w:bottom w:w="0" w:type="dxa"/>
-          </w:tblCellMar>
-        </w:tblPrEx>
         <w:tc>
           <w:tcPr>
             <w:tcW w:w="4200" w:type="dxa"/>
@@ -2834,6 +2672,34 @@
         </w:tc>
       </w:tr>
     </w:tbl>
+    <w:p>
+      <w:pPr>
+        <w:spacing w:after="160"/>
+        <w:rPr>
+          <w:rFonts w:ascii="Calibri" w:hAnsi="Calibri" w:cs="Calibri"/>
+          <w:sz w:val="24"/>
+          <w:szCs w:val="24"/>
+        </w:rPr>
+      </w:pPr>
+    </w:p>
+    <w:p>
+      <w:pPr>
+        <w:spacing w:after="160"/>
+        <w:rPr>
+          <w:rFonts w:ascii="Calibri" w:hAnsi="Calibri" w:cs="Calibri"/>
+          <w:sz w:val="24"/>
+          <w:szCs w:val="24"/>
+        </w:rPr>
+      </w:pPr>
+      <w:r>
+        <w:rPr>
+          <w:rFonts w:ascii="Calibri" w:hAnsi="Calibri" w:cs="Calibri"/>
+          <w:sz w:val="24"/>
+          <w:szCs w:val="24"/>
+        </w:rPr>
+        <w:t>EV Adoption Lag, Median Income  &amp; EV Charging Density features seem to have the highest correlation with EV Adoption.</w:t>
+      </w:r>
+    </w:p>
     <w:p>
       <w:pPr>
         <w:spacing w:after="160"/>
@@ -2911,6 +2777,80 @@
           </wp:inline>
         </w:drawing>
       </w:r>
+    </w:p>
+    <w:p>
+      <w:pPr>
+        <w:spacing w:after="160"/>
+        <w:rPr>
+          <w:rFonts w:ascii="Calibri" w:hAnsi="Calibri" w:cs="Calibri"/>
+          <w:sz w:val="24"/>
+          <w:szCs w:val="24"/>
+        </w:rPr>
+      </w:pPr>
+    </w:p>
+    <w:p>
+      <w:pPr>
+        <w:spacing w:after="160"/>
+        <w:rPr>
+          <w:rFonts w:ascii="Calibri" w:hAnsi="Calibri" w:cs="Calibri"/>
+          <w:sz w:val="24"/>
+          <w:szCs w:val="24"/>
+        </w:rPr>
+      </w:pPr>
+      <w:r>
+        <w:rPr>
+          <w:rFonts w:ascii="Calibri" w:hAnsi="Calibri" w:cs="Calibri"/>
+          <w:sz w:val="24"/>
+          <w:szCs w:val="24"/>
+        </w:rPr>
+        <w:t xml:space="preserve">The boxplots reveal a clear socio-economic divide where high-adoption regions are clearly separated by higher median incomes, charging station densities, and historical adoption momentum, while highlighting extreme population outliers and the heavy visual redundancy of the vehicle-mix features such as </w:t>
+      </w:r>
+      <w:proofErr w:type="spellStart"/>
+      <w:r>
+        <w:rPr>
+          <w:rFonts w:ascii="Calibri" w:hAnsi="Calibri" w:cs="Calibri"/>
+          <w:sz w:val="24"/>
+          <w:szCs w:val="24"/>
+        </w:rPr>
+        <w:t>cafv_eligibility_rate</w:t>
+      </w:r>
+      <w:proofErr w:type="spellEnd"/>
+      <w:r>
+        <w:rPr>
+          <w:rFonts w:ascii="Calibri" w:hAnsi="Calibri" w:cs="Calibri"/>
+          <w:sz w:val="24"/>
+          <w:szCs w:val="24"/>
+        </w:rPr>
+        <w:t xml:space="preserve"> &amp; </w:t>
+      </w:r>
+      <w:proofErr w:type="spellStart"/>
+      <w:r>
+        <w:rPr>
+          <w:rFonts w:ascii="Calibri" w:hAnsi="Calibri" w:cs="Calibri"/>
+          <w:sz w:val="24"/>
+          <w:szCs w:val="24"/>
+        </w:rPr>
+        <w:t>bev_ratio_within_ev</w:t>
+      </w:r>
+      <w:proofErr w:type="spellEnd"/>
+      <w:r>
+        <w:rPr>
+          <w:rFonts w:ascii="Calibri" w:hAnsi="Calibri" w:cs="Calibri"/>
+          <w:sz w:val="24"/>
+          <w:szCs w:val="24"/>
+        </w:rPr>
+        <w:t xml:space="preserve"> (showing compressed, high-positioned medians for high-adoption zones).</w:t>
+      </w:r>
+    </w:p>
+    <w:p>
+      <w:pPr>
+        <w:spacing w:after="160"/>
+        <w:rPr>
+          <w:rFonts w:ascii="Calibri" w:hAnsi="Calibri" w:cs="Calibri"/>
+          <w:sz w:val="24"/>
+          <w:szCs w:val="24"/>
+        </w:rPr>
+      </w:pPr>
     </w:p>
     <w:p>
       <w:pPr>
@@ -3097,6 +3037,52 @@
           <w:szCs w:val="24"/>
         </w:rPr>
       </w:pPr>
+    </w:p>
+    <w:p>
+      <w:pPr>
+        <w:spacing w:after="160"/>
+        <w:rPr>
+          <w:rFonts w:ascii="Calibri" w:hAnsi="Calibri" w:cs="Calibri"/>
+          <w:sz w:val="24"/>
+          <w:szCs w:val="24"/>
+        </w:rPr>
+      </w:pPr>
+      <w:r>
+        <w:rPr>
+          <w:rFonts w:ascii="Calibri" w:hAnsi="Calibri" w:cs="Calibri"/>
+          <w:sz w:val="24"/>
+          <w:szCs w:val="24"/>
+        </w:rPr>
+        <w:t xml:space="preserve">The top 5 vs. bottom 5 counties EV Adoption trends (below) show a huge divide where high </w:t>
+      </w:r>
+      <w:proofErr w:type="spellStart"/>
+      <w:r>
+        <w:rPr>
+          <w:rFonts w:ascii="Calibri" w:hAnsi="Calibri" w:cs="Calibri"/>
+          <w:sz w:val="24"/>
+          <w:szCs w:val="24"/>
+        </w:rPr>
+        <w:t>ev</w:t>
+      </w:r>
+      <w:proofErr w:type="spellEnd"/>
+      <w:r>
+        <w:rPr>
+          <w:rFonts w:ascii="Calibri" w:hAnsi="Calibri" w:cs="Calibri"/>
+          <w:sz w:val="24"/>
+          <w:szCs w:val="24"/>
+        </w:rPr>
+        <w:t xml:space="preserve"> adoption counties have achieved an exponential momentum while low adoption counties are seeing 0 to extremely low adoption potentially due to low population, lack of income, infrastructure and policies.</w:t>
+      </w:r>
+    </w:p>
+    <w:p>
+      <w:pPr>
+        <w:spacing w:after="160"/>
+        <w:rPr>
+          <w:rFonts w:ascii="Calibri" w:hAnsi="Calibri" w:cs="Calibri"/>
+          <w:sz w:val="24"/>
+          <w:szCs w:val="24"/>
+        </w:rPr>
+      </w:pPr>
       <w:r>
         <w:rPr>
           <w:rFonts w:ascii="Calibri" w:hAnsi="Calibri" w:cs="Calibri"/>
@@ -3106,10 +3092,10 @@
         </w:rPr>
         <w:lastRenderedPageBreak/>
         <w:drawing>
-          <wp:inline distT="0" distB="0" distL="0" distR="0" wp14:anchorId="5BBFF75E" wp14:editId="6948EF8E">
+          <wp:inline distT="0" distB="0" distL="0" distR="0" wp14:anchorId="6FD6E677" wp14:editId="1FC586DD">
             <wp:extent cx="5754636" cy="4291593"/>
             <wp:effectExtent l="0" t="0" r="0" b="0"/>
-            <wp:docPr id="1146352224" name="Picture 12"/>
+            <wp:docPr id="706202614" name="Picture 1"/>
             <wp:cNvGraphicFramePr>
               <a:graphicFrameLocks xmlns:a="http://schemas.openxmlformats.org/drawingml/2006/main" noChangeAspect="1"/>
             </wp:cNvGraphicFramePr>
@@ -3117,7 +3103,7 @@
               <a:graphicData uri="http://schemas.openxmlformats.org/drawingml/2006/picture">
                 <pic:pic xmlns:pic="http://schemas.openxmlformats.org/drawingml/2006/picture">
                   <pic:nvPicPr>
-                    <pic:cNvPr id="1146352224" name="Picture 1146352224"/>
+                    <pic:cNvPr id="706202614" name="Picture 706202614"/>
                     <pic:cNvPicPr/>
                   </pic:nvPicPr>
                   <pic:blipFill>
@@ -3150,6 +3136,66 @@
     </w:p>
     <w:p>
       <w:pPr>
+        <w:spacing w:after="160"/>
+        <w:rPr>
+          <w:rFonts w:ascii="Calibri" w:hAnsi="Calibri" w:cs="Calibri"/>
+          <w:sz w:val="24"/>
+          <w:szCs w:val="24"/>
+        </w:rPr>
+      </w:pPr>
+      <w:r>
+        <w:rPr>
+          <w:rFonts w:ascii="Calibri" w:hAnsi="Calibri" w:cs="Calibri"/>
+          <w:noProof/>
+          <w:sz w:val="24"/>
+          <w:szCs w:val="24"/>
+        </w:rPr>
+        <w:lastRenderedPageBreak/>
+        <w:drawing>
+          <wp:inline distT="0" distB="0" distL="0" distR="0" wp14:anchorId="5BBFF75E" wp14:editId="6948EF8E">
+            <wp:extent cx="5754636" cy="4291593"/>
+            <wp:effectExtent l="0" t="0" r="0" b="0"/>
+            <wp:docPr id="1146352224" name="Picture 12"/>
+            <wp:cNvGraphicFramePr>
+              <a:graphicFrameLocks xmlns:a="http://schemas.openxmlformats.org/drawingml/2006/main" noChangeAspect="1"/>
+            </wp:cNvGraphicFramePr>
+            <a:graphic xmlns:a="http://schemas.openxmlformats.org/drawingml/2006/main">
+              <a:graphicData uri="http://schemas.openxmlformats.org/drawingml/2006/picture">
+                <pic:pic xmlns:pic="http://schemas.openxmlformats.org/drawingml/2006/picture">
+                  <pic:nvPicPr>
+                    <pic:cNvPr id="1146352224" name="Picture 1146352224"/>
+                    <pic:cNvPicPr/>
+                  </pic:nvPicPr>
+                  <pic:blipFill>
+                    <a:blip r:embed="rId19" cstate="print">
+                      <a:extLst>
+                        <a:ext uri="{28A0092B-C50C-407E-A947-70E740481C1C}">
+                          <a14:useLocalDpi xmlns:a14="http://schemas.microsoft.com/office/drawing/2010/main" val="0"/>
+                        </a:ext>
+                      </a:extLst>
+                    </a:blip>
+                    <a:stretch>
+                      <a:fillRect/>
+                    </a:stretch>
+                  </pic:blipFill>
+                  <pic:spPr>
+                    <a:xfrm>
+                      <a:off x="0" y="0"/>
+                      <a:ext cx="5754636" cy="4291593"/>
+                    </a:xfrm>
+                    <a:prstGeom prst="rect">
+                      <a:avLst/>
+                    </a:prstGeom>
+                  </pic:spPr>
+                </pic:pic>
+              </a:graphicData>
+            </a:graphic>
+          </wp:inline>
+        </w:drawing>
+      </w:r>
+    </w:p>
+    <w:p>
+      <w:pPr>
         <w:pStyle w:val="Heading3"/>
         <w:spacing w:before="220" w:after="120"/>
         <w:rPr>
@@ -3182,7 +3228,15 @@
           <w:sz w:val="24"/>
           <w:szCs w:val="24"/>
         </w:rPr>
-        <w:t>Log transformation reduced but did not fully normalize skew in several key features. A Yeo–Johnson power transform was applied instead to population, median income, EV charging density, EV adoption lag, and the target variable, producing more model-friendly (though still non-normal, block-shaped) distributions. Because Ridge regression's core requirement is normally distributed residuals — not normally distributed inputs — and Ridge's L2 penalty stabilizes coefficients under non-normal feature distributions, this was judged acceptable. A variance inflation factor (VIF) check confirmed low multicollinearity across the retained feature set (all VIF values below 4.3).</w:t>
+        <w:t>Log transformation reduced but did not fully normalize skew in several key features. A Yeo–Johnson power transform was applied instead to population, median income, EV charging density, EV adoption lag, and the target variable, producing more model-friendly (though still non-normal, block-shaped) distributions. Because Ridge regression's core requirement is normally distributed residuals — not normally distributed inputs — and Ridge's L2 penalty stabilizes coefficients under non-normal feature distributions</w:t>
+      </w:r>
+      <w:r>
+        <w:rPr>
+          <w:rFonts w:ascii="Calibri" w:hAnsi="Calibri" w:cs="Calibri"/>
+          <w:sz w:val="24"/>
+          <w:szCs w:val="24"/>
+        </w:rPr>
+        <w:t>, this was judged acceptable. A variance inflation factor (VIF) check confirmed low multicollinearity across the retained feature set (all VIF values below 4.3).</w:t>
       </w:r>
     </w:p>
     <w:p>
@@ -3236,7 +3290,7 @@
                     <pic:cNvPicPr/>
                   </pic:nvPicPr>
                   <pic:blipFill>
-                    <a:blip r:embed="rId19" cstate="print">
+                    <a:blip r:embed="rId20" cstate="print">
                       <a:extLst>
                         <a:ext uri="{28A0092B-C50C-407E-A947-70E740481C1C}">
                           <a14:useLocalDpi xmlns:a14="http://schemas.microsoft.com/office/drawing/2010/main" val="0"/>
@@ -3403,7 +3457,15 @@
           <w:sz w:val="24"/>
           <w:szCs w:val="24"/>
         </w:rPr>
-        <w:t>Because the dataset is a county-year panel / time series, a time-aware split was used: training data covers 2017–2023 and test data covers 2024–2025 (an approximately 80/20 split). A random split was avoided to prevent future information from leaking into training. Numeric features were standardized with a StandardScaler fit on the training data only (for the regression set); no train/test split was applied for the unsupervised K-Means model, which used the full dataset with the adoption rate retained purely as a post-hoc interpretive label.</w:t>
+        <w:t>Because the dataset is a county-year panel / time series, a time-aware split was used: training data covers 2017–2023 and test data covers 2024–2025 (an approximately 80/20 split). A random split was avoided to prevent future information from leaking into training. Numeric features were standardized with a StandardScaler fit on the training data only (for the regression set); no train/test split was applied for the unsupervised K-Means model, which used the full dataset with the adoption rate retained purel</w:t>
+      </w:r>
+      <w:r>
+        <w:rPr>
+          <w:rFonts w:ascii="Calibri" w:hAnsi="Calibri" w:cs="Calibri"/>
+          <w:sz w:val="24"/>
+          <w:szCs w:val="24"/>
+        </w:rPr>
+        <w:t>y as a post-hoc interpretive label.</w:t>
       </w:r>
     </w:p>
     <w:p>
@@ -3597,12 +3659,6 @@
         <w:gridCol w:w="3500"/>
       </w:tblGrid>
       <w:tr>
-        <w:tblPrEx>
-          <w:tblCellMar>
-            <w:top w:w="0" w:type="dxa"/>
-            <w:bottom w:w="0" w:type="dxa"/>
-          </w:tblCellMar>
-        </w:tblPrEx>
         <w:trPr>
           <w:tblHeader/>
         </w:trPr>
@@ -3686,12 +3742,6 @@
         </w:tc>
       </w:tr>
       <w:tr>
-        <w:tblPrEx>
-          <w:tblCellMar>
-            <w:top w:w="0" w:type="dxa"/>
-            <w:bottom w:w="0" w:type="dxa"/>
-          </w:tblCellMar>
-        </w:tblPrEx>
         <w:tc>
           <w:tcPr>
             <w:tcW w:w="3000" w:type="dxa"/>
@@ -3732,7 +3782,15 @@
                 <w:sz w:val="24"/>
                 <w:szCs w:val="24"/>
               </w:rPr>
-              <w:t>—</w:t>
+              <w:t xml:space="preserve">≈ </w:t>
+            </w:r>
+            <w:r>
+              <w:rPr>
+                <w:rFonts w:ascii="Calibri" w:hAnsi="Calibri" w:cs="Calibri"/>
+                <w:sz w:val="24"/>
+                <w:szCs w:val="24"/>
+              </w:rPr>
+              <w:t>0.95</w:t>
             </w:r>
           </w:p>
         </w:tc>
@@ -3760,12 +3818,6 @@
         </w:tc>
       </w:tr>
       <w:tr>
-        <w:tblPrEx>
-          <w:tblCellMar>
-            <w:top w:w="0" w:type="dxa"/>
-            <w:bottom w:w="0" w:type="dxa"/>
-          </w:tblCellMar>
-        </w:tblPrEx>
         <w:tc>
           <w:tcPr>
             <w:tcW w:w="3000" w:type="dxa"/>
@@ -3806,7 +3858,15 @@
                 <w:sz w:val="24"/>
                 <w:szCs w:val="24"/>
               </w:rPr>
-              <w:t>—</w:t>
+              <w:t xml:space="preserve">≈ </w:t>
+            </w:r>
+            <w:r>
+              <w:rPr>
+                <w:rFonts w:ascii="Calibri" w:hAnsi="Calibri" w:cs="Calibri"/>
+                <w:sz w:val="24"/>
+                <w:szCs w:val="24"/>
+              </w:rPr>
+              <w:t>0.2</w:t>
             </w:r>
           </w:p>
         </w:tc>
@@ -3834,12 +3894,6 @@
         </w:tc>
       </w:tr>
       <w:tr>
-        <w:tblPrEx>
-          <w:tblCellMar>
-            <w:top w:w="0" w:type="dxa"/>
-            <w:bottom w:w="0" w:type="dxa"/>
-          </w:tblCellMar>
-        </w:tblPrEx>
         <w:tc>
           <w:tcPr>
             <w:tcW w:w="3000" w:type="dxa"/>
@@ -3880,7 +3934,15 @@
                 <w:sz w:val="24"/>
                 <w:szCs w:val="24"/>
               </w:rPr>
-              <w:t>—</w:t>
+              <w:t xml:space="preserve">≈ </w:t>
+            </w:r>
+            <w:r>
+              <w:rPr>
+                <w:rFonts w:ascii="Calibri" w:hAnsi="Calibri" w:cs="Calibri"/>
+                <w:sz w:val="24"/>
+                <w:szCs w:val="24"/>
+              </w:rPr>
+              <w:t>0.13</w:t>
             </w:r>
           </w:p>
         </w:tc>
@@ -3937,14 +3999,6 @@
           <w:szCs w:val="24"/>
         </w:rPr>
       </w:pPr>
-      <w:r>
-        <w:rPr>
-          <w:rFonts w:ascii="Calibri" w:hAnsi="Calibri" w:cs="Calibri"/>
-          <w:sz w:val="24"/>
-          <w:szCs w:val="24"/>
-        </w:rPr>
-        <w:t xml:space="preserve"> </w:t>
-      </w:r>
     </w:p>
     <w:p>
       <w:pPr>
@@ -4089,7 +4143,7 @@
                     <pic:cNvPicPr/>
                   </pic:nvPicPr>
                   <pic:blipFill>
-                    <a:blip r:embed="rId20" cstate="print">
+                    <a:blip r:embed="rId21" cstate="print">
                       <a:extLst>
                         <a:ext uri="{28A0092B-C50C-407E-A947-70E740481C1C}">
                           <a14:useLocalDpi xmlns:a14="http://schemas.microsoft.com/office/drawing/2010/main" val="0"/>
@@ -4183,7 +4237,7 @@
                     <pic:cNvPicPr/>
                   </pic:nvPicPr>
                   <pic:blipFill>
-                    <a:blip r:embed="rId21" cstate="print">
+                    <a:blip r:embed="rId22" cstate="print">
                       <a:extLst>
                         <a:ext uri="{28A0092B-C50C-407E-A947-70E740481C1C}">
                           <a14:useLocalDpi xmlns:a14="http://schemas.microsoft.com/office/drawing/2010/main" val="0"/>
@@ -4243,7 +4297,7 @@
                     <pic:cNvPicPr/>
                   </pic:nvPicPr>
                   <pic:blipFill>
-                    <a:blip r:embed="rId22" cstate="print">
+                    <a:blip r:embed="rId23" cstate="print">
                       <a:extLst>
                         <a:ext uri="{28A0092B-C50C-407E-A947-70E740481C1C}">
                           <a14:useLocalDpi xmlns:a14="http://schemas.microsoft.com/office/drawing/2010/main" val="0"/>
@@ -4319,12 +4373,6 @@
         <w:gridCol w:w="1369"/>
       </w:tblGrid>
       <w:tr>
-        <w:tblPrEx>
-          <w:tblCellMar>
-            <w:top w:w="0" w:type="dxa"/>
-            <w:bottom w:w="0" w:type="dxa"/>
-          </w:tblCellMar>
-        </w:tblPrEx>
         <w:trPr>
           <w:tblHeader/>
         </w:trPr>
@@ -4486,12 +4534,6 @@
         </w:tc>
       </w:tr>
       <w:tr>
-        <w:tblPrEx>
-          <w:tblCellMar>
-            <w:top w:w="0" w:type="dxa"/>
-            <w:bottom w:w="0" w:type="dxa"/>
-          </w:tblCellMar>
-        </w:tblPrEx>
         <w:tc>
           <w:tcPr>
             <w:tcW w:w="2600" w:type="dxa"/>
@@ -4626,12 +4668,6 @@
         </w:tc>
       </w:tr>
       <w:tr>
-        <w:tblPrEx>
-          <w:tblCellMar>
-            <w:top w:w="0" w:type="dxa"/>
-            <w:bottom w:w="0" w:type="dxa"/>
-          </w:tblCellMar>
-        </w:tblPrEx>
         <w:tc>
           <w:tcPr>
             <w:tcW w:w="2600" w:type="dxa"/>
@@ -4766,12 +4802,6 @@
         </w:tc>
       </w:tr>
       <w:tr>
-        <w:tblPrEx>
-          <w:tblCellMar>
-            <w:top w:w="0" w:type="dxa"/>
-            <w:bottom w:w="0" w:type="dxa"/>
-          </w:tblCellMar>
-        </w:tblPrEx>
         <w:tc>
           <w:tcPr>
             <w:tcW w:w="2600" w:type="dxa"/>
@@ -4991,7 +5021,7 @@
                     <pic:cNvPicPr/>
                   </pic:nvPicPr>
                   <pic:blipFill>
-                    <a:blip r:embed="rId23" cstate="print">
+                    <a:blip r:embed="rId24" cstate="print">
                       <a:extLst>
                         <a:ext uri="{28A0092B-C50C-407E-A947-70E740481C1C}">
                           <a14:useLocalDpi xmlns:a14="http://schemas.microsoft.com/office/drawing/2010/main" val="0"/>
@@ -5051,7 +5081,7 @@
                     <pic:cNvPicPr/>
                   </pic:nvPicPr>
                   <pic:blipFill>
-                    <a:blip r:embed="rId24" cstate="print">
+                    <a:blip r:embed="rId25" cstate="print">
                       <a:extLst>
                         <a:ext uri="{28A0092B-C50C-407E-A947-70E740481C1C}">
                           <a14:useLocalDpi xmlns:a14="http://schemas.microsoft.com/office/drawing/2010/main" val="0"/>
@@ -5268,12 +5298,6 @@
         <w:gridCol w:w="1700"/>
       </w:tblGrid>
       <w:tr>
-        <w:tblPrEx>
-          <w:tblCellMar>
-            <w:top w:w="0" w:type="dxa"/>
-            <w:bottom w:w="0" w:type="dxa"/>
-          </w:tblCellMar>
-        </w:tblPrEx>
         <w:trPr>
           <w:tblHeader/>
         </w:trPr>
@@ -5409,12 +5433,6 @@
         </w:tc>
       </w:tr>
       <w:tr>
-        <w:tblPrEx>
-          <w:tblCellMar>
-            <w:top w:w="0" w:type="dxa"/>
-            <w:bottom w:w="0" w:type="dxa"/>
-          </w:tblCellMar>
-        </w:tblPrEx>
         <w:tc>
           <w:tcPr>
             <w:tcW w:w="1400" w:type="dxa"/>
@@ -5527,12 +5545,6 @@
         </w:tc>
       </w:tr>
       <w:tr>
-        <w:tblPrEx>
-          <w:tblCellMar>
-            <w:top w:w="0" w:type="dxa"/>
-            <w:bottom w:w="0" w:type="dxa"/>
-          </w:tblCellMar>
-        </w:tblPrEx>
         <w:tc>
           <w:tcPr>
             <w:tcW w:w="1400" w:type="dxa"/>
@@ -5698,12 +5710,6 @@
         </w:tc>
       </w:tr>
       <w:tr>
-        <w:tblPrEx>
-          <w:tblCellMar>
-            <w:top w:w="0" w:type="dxa"/>
-            <w:bottom w:w="0" w:type="dxa"/>
-          </w:tblCellMar>
-        </w:tblPrEx>
         <w:tc>
           <w:tcPr>
             <w:tcW w:w="1400" w:type="dxa"/>
@@ -6318,23 +6324,7 @@
           <w:sz w:val="24"/>
           <w:szCs w:val="24"/>
         </w:rPr>
-        <w:t xml:space="preserve"> recommendations </w:t>
-      </w:r>
-      <w:r>
-        <w:rPr>
-          <w:rFonts w:ascii="Calibri" w:hAnsi="Calibri" w:cs="Calibri"/>
-          <w:sz w:val="24"/>
-          <w:szCs w:val="24"/>
-        </w:rPr>
-        <w:t>directly and</w:t>
-      </w:r>
-      <w:r>
-        <w:rPr>
-          <w:rFonts w:ascii="Calibri" w:hAnsi="Calibri" w:cs="Calibri"/>
-          <w:sz w:val="24"/>
-          <w:szCs w:val="24"/>
-        </w:rPr>
-        <w:t xml:space="preserve"> refresh it as new registration data becomes available.</w:t>
+        <w:t xml:space="preserve"> recommendations directly and refresh it as new registration data becomes available.</w:t>
       </w:r>
     </w:p>
     <w:p>
@@ -6390,7 +6380,15 @@
           <w:sz w:val="24"/>
           <w:szCs w:val="24"/>
         </w:rPr>
-        <w:t xml:space="preserve">This project delivers a reusable, data-driven framework for identifying and prioritizing high-impact regions for EV infrastructure investment. The Ridge regression model quantifies which factors drive county-level adoption — prior adoption momentum, income, and infrastructure, in that order of importance — while the K-Means clustering model translates those drivers into three actionable policy segments. Together, they support a phased, funding-mechanism-specific deployment strategy that concentrates scarce public capital where it will have the greatest impact, while allowing private capital to scale adoption in </w:t>
+        <w:t xml:space="preserve">This project delivers a reusable, data-driven framework for identifying and prioritizing high-impact regions for EV infrastructure investment. The Ridge regression model quantifies which factors drive county-level adoption — prior adoption momentum, income, and infrastructure, in that order of importance — while the K-Means clustering model translates those drivers into three actionable policy segments. Together, they support a phased, funding-mechanism-specific deployment strategy that concentrates scarce </w:t>
+      </w:r>
+      <w:r>
+        <w:rPr>
+          <w:rFonts w:ascii="Calibri" w:hAnsi="Calibri" w:cs="Calibri"/>
+          <w:sz w:val="24"/>
+          <w:szCs w:val="24"/>
+        </w:rPr>
+        <w:t xml:space="preserve">public capital where it will have the greatest impact, while allowing private capital to scale adoption in </w:t>
       </w:r>
       <w:r>
         <w:rPr>
@@ -6777,15 +6775,6 @@
   </w:num>
   <w:num w:numId="4" w16cid:durableId="1605453465">
     <w:abstractNumId w:val="1"/>
-    <w:lvlOverride w:ilvl="0"/>
-    <w:lvlOverride w:ilvl="1"/>
-    <w:lvlOverride w:ilvl="2"/>
-    <w:lvlOverride w:ilvl="3"/>
-    <w:lvlOverride w:ilvl="4"/>
-    <w:lvlOverride w:ilvl="5"/>
-    <w:lvlOverride w:ilvl="6"/>
-    <w:lvlOverride w:ilvl="7"/>
-    <w:lvlOverride w:ilvl="8"/>
   </w:num>
 </w:numbering>
 </file>

</xml_diff>